<commit_message>
New Haskama, more typesetting
</commit_message>
<xml_diff>
--- a/Files/06 - Yom Tov/09 - Rosh Hashana/Rosh Hashana in Berditchev/Rosh Hashana in Berditchev.docx
+++ b/Files/06 - Yom Tov/09 - Rosh Hashana/Rosh Hashana in Berditchev/Rosh Hashana in Berditchev.docx
@@ -593,7 +593,7 @@
         <w:rPr>
           <w:rFonts w:ascii="Times New Roman" w:hAnsi="Times New Roman" w:cs="Times New Roman"/>
         </w:rPr>
-        <w:t>, while the congregation repeated him until he came to the line</w:t>
+        <w:t xml:space="preserve">, while the congregation repeated him until he came to the line </w:t>
       </w:r>
       <w:r>
         <w:rPr>
@@ -2207,7 +2207,7 @@
         <w:rPr>
           <w:rFonts w:ascii="Times New Roman" w:hAnsi="Times New Roman" w:cs="Times New Roman"/>
         </w:rPr>
-        <w:t>. We are the</w:t>
+        <w:t xml:space="preserve">. We are the </w:t>
       </w:r>
       <w:r>
         <w:rPr>

</xml_diff>

<commit_message>
Final Sefer - RH in Berditchev
</commit_message>
<xml_diff>
--- a/Files/06 - Yom Tov/09 - Rosh Hashana/Rosh Hashana in Berditchev/Rosh Hashana in Berditchev.docx
+++ b/Files/06 - Yom Tov/09 - Rosh Hashana/Rosh Hashana in Berditchev/Rosh Hashana in Berditchev.docx
@@ -586,7 +586,7 @@
         <w:rPr>
           <w:rFonts w:ascii="Times New Roman" w:hAnsi="Times New Roman" w:cs="Times New Roman"/>
         </w:rPr>
-        <w:t>, while the congregation repeated him until he came to the line</w:t>
+        <w:t xml:space="preserve">, while the congregation repeated him until he came to the line </w:t>
       </w:r>
       <w:r>
         <w:rPr>
@@ -2200,7 +2200,7 @@
         <w:rPr>
           <w:rFonts w:ascii="Times New Roman" w:hAnsi="Times New Roman" w:cs="Times New Roman"/>
         </w:rPr>
-        <w:t>. We are the</w:t>
+        <w:t xml:space="preserve">. We are the </w:t>
       </w:r>
       <w:r>
         <w:rPr>

</xml_diff>